<commit_message>
Prepare AJPT revision submission package
</commit_message>
<xml_diff>
--- a/submission/AJPT_Cover_Letter.docx
+++ b/submission/AJPT_Cover_Letter.docx
@@ -44,17 +44,17 @@
     </w:p>
     <w:p>
       <w:r>
-        <w:t>The manuscript is designed as an auditing research methodology contribution. It does not propose an audit procedure, audit engagement workflow, auditor decision aid, or model-performance benchmark. XBRL is treated as management-reported structured accounting data that can support research-data construction and source traceability, not as audit evidence or ground truth. The SEC/XBRL demonstration is descriptive and methodological: it illustrates how text retrieval, XBRL relational retrieval, hybrid retrieval, and an LLM-only diagnostic baseline create different evidence environments for LLM-based auditing research.</w:t>
-      </w:r>
-    </w:p>
-    <w:p>
-      <w:r>
-        <w:t>The submission package includes a two-layer methodological demonstration. The main manuscript uses three familiar SEC filers for deep claim-level illustration. The online supplement reports a bounded six-filer extension spanning retail, specialty retail, industrial manufacturing, pharma, software/cloud, and mid-size consumer products. The extension is not used to estimate population-level performance or failure-mode prevalence; it tests whether the retrieval-environment validity protocol remains applicable across varied reporting environments.</w:t>
-      </w:r>
-    </w:p>
-    <w:p>
-      <w:r>
-        <w:t>To support reviewer inspection, we submit the manuscript with a separate tables and figures file, an online appendix/supplement, and replication materials. The supplement documents the source corpus, retrieval artifacts, prompts, LLM outputs, claim-level coding, selected source spot checks, bounded-extension diagnostics, and sensitivity guidance. The replication materials include the filer manifest, extraction and retrieval scripts, text chunks, XBRL fact and relation-path tables, retrieval logs, rendered prompts, raw LLM outputs, claim-level coding files, a replication README, a local model metadata note, and a SHA-256 checksum manifest.</w:t>
+        <w:t>The manuscript is designed as an auditing research methodology contribution. It does not propose an audit procedure, audit engagement workflow, auditor decision aid, or model-performance benchmark. XBRL is treated as management-reported structured accounting data that can support research-data construction and source traceability, not as audit evidence or ground truth. The SEC/XBRL demonstration is a methodological protocol-validation exercise: it shows how text retrieval, XBRL relational retrieval, hybrid retrieval, and an LLM-only diagnostic baseline create different evidence environments for LLM-based auditing research and how those environments can be logged, reconstructed, and evaluated at the claim level.</w:t>
+      </w:r>
+    </w:p>
+    <w:p>
+      <w:r>
+        <w:t>The submission package includes a full-scale nine-filer, two-layer methodological protocol-validation package. Three familiar SEC filers support deep claim-level illustration. Six additional filers provide a bounded applicability check spanning retail, specialty retail, industrial manufacturing, pharma, software/cloud, and mid-size consumer products. Across all nine filers, the package applies two audit constructs and four retrieval conditions, producing 72 retrieval-conditioned outputs and 281 preliminary coded claims. The extension is not used to estimate population-level performance or failure-mode prevalence; it tests whether the retrieval-environment validity protocol remains applicable across varied reporting environments.</w:t>
+      </w:r>
+    </w:p>
+    <w:p>
+      <w:r>
+        <w:t>To support reviewer inspection, we submit the manuscript with a separate tables and figures file, an online appendix/supplement, and replication materials. The supplement documents the source corpus, retrieval artifacts, prompts, LLM outputs, claim-level coding, selected source spot checks, bounded-extension diagnostics, context-volume and source-environment perturbation diagnostics, sensitivity guidance, and a Tier 2 model-validation design for future studies making performance claims. The replication materials include the filer manifest, extraction and retrieval scripts, text chunks, XBRL fact and relation-path tables, retrieval logs, rendered prompts, raw LLM outputs, claim-level coding files, retrieval diagnostics, a replication README, a local model metadata note, and a SHA-256 checksum manifest.</w:t>
       </w:r>
     </w:p>
     <w:p>
@@ -522,7 +522,7 @@
     <w:link w:val="Heading1Char"/>
     <w:uiPriority w:val="9"/>
     <w:qFormat/>
-    <w:rsid w:val="001A40AC"/>
+    <w:rsid w:val="00A96B41"/>
     <w:pPr>
       <w:keepNext/>
       <w:keepLines/>
@@ -531,7 +531,7 @@
     </w:pPr>
     <w:rPr>
       <w:rFonts w:asciiTheme="majorHAnsi" w:eastAsiaTheme="majorEastAsia" w:hAnsiTheme="majorHAnsi" w:cstheme="majorBidi"/>
-      <w:color w:val="0F4761" w:themeColor="accent1" w:themeShade="BF"/>
+      <w:color w:val="2F5496" w:themeColor="accent1" w:themeShade="BF"/>
       <w:sz w:val="40"/>
       <w:szCs w:val="40"/>
     </w:rPr>
@@ -545,7 +545,7 @@
     <w:semiHidden/>
     <w:unhideWhenUsed/>
     <w:qFormat/>
-    <w:rsid w:val="001A40AC"/>
+    <w:rsid w:val="00A96B41"/>
     <w:pPr>
       <w:keepNext/>
       <w:keepLines/>
@@ -554,7 +554,7 @@
     </w:pPr>
     <w:rPr>
       <w:rFonts w:asciiTheme="majorHAnsi" w:eastAsiaTheme="majorEastAsia" w:hAnsiTheme="majorHAnsi" w:cstheme="majorBidi"/>
-      <w:color w:val="0F4761" w:themeColor="accent1" w:themeShade="BF"/>
+      <w:color w:val="2F5496" w:themeColor="accent1" w:themeShade="BF"/>
       <w:sz w:val="32"/>
       <w:szCs w:val="32"/>
     </w:rPr>
@@ -568,7 +568,7 @@
     <w:semiHidden/>
     <w:unhideWhenUsed/>
     <w:qFormat/>
-    <w:rsid w:val="001A40AC"/>
+    <w:rsid w:val="00A96B41"/>
     <w:pPr>
       <w:keepNext/>
       <w:keepLines/>
@@ -577,7 +577,7 @@
     </w:pPr>
     <w:rPr>
       <w:rFonts w:eastAsiaTheme="majorEastAsia" w:cstheme="majorBidi"/>
-      <w:color w:val="0F4761" w:themeColor="accent1" w:themeShade="BF"/>
+      <w:color w:val="2F5496" w:themeColor="accent1" w:themeShade="BF"/>
       <w:sz w:val="28"/>
       <w:szCs w:val="28"/>
     </w:rPr>
@@ -591,7 +591,7 @@
     <w:semiHidden/>
     <w:unhideWhenUsed/>
     <w:qFormat/>
-    <w:rsid w:val="001A40AC"/>
+    <w:rsid w:val="00A96B41"/>
     <w:pPr>
       <w:keepNext/>
       <w:keepLines/>
@@ -602,7 +602,7 @@
       <w:rFonts w:eastAsiaTheme="majorEastAsia" w:cstheme="majorBidi"/>
       <w:i/>
       <w:iCs/>
-      <w:color w:val="0F4761" w:themeColor="accent1" w:themeShade="BF"/>
+      <w:color w:val="2F5496" w:themeColor="accent1" w:themeShade="BF"/>
     </w:rPr>
   </w:style>
   <w:style w:type="paragraph" w:styleId="Heading5">
@@ -614,7 +614,7 @@
     <w:semiHidden/>
     <w:unhideWhenUsed/>
     <w:qFormat/>
-    <w:rsid w:val="001A40AC"/>
+    <w:rsid w:val="00A96B41"/>
     <w:pPr>
       <w:keepNext/>
       <w:keepLines/>
@@ -623,7 +623,7 @@
     </w:pPr>
     <w:rPr>
       <w:rFonts w:eastAsiaTheme="majorEastAsia" w:cstheme="majorBidi"/>
-      <w:color w:val="0F4761" w:themeColor="accent1" w:themeShade="BF"/>
+      <w:color w:val="2F5496" w:themeColor="accent1" w:themeShade="BF"/>
     </w:rPr>
   </w:style>
   <w:style w:type="paragraph" w:styleId="Heading6">
@@ -635,7 +635,7 @@
     <w:semiHidden/>
     <w:unhideWhenUsed/>
     <w:qFormat/>
-    <w:rsid w:val="001A40AC"/>
+    <w:rsid w:val="00A96B41"/>
     <w:pPr>
       <w:keepNext/>
       <w:keepLines/>
@@ -658,7 +658,7 @@
     <w:semiHidden/>
     <w:unhideWhenUsed/>
     <w:qFormat/>
-    <w:rsid w:val="001A40AC"/>
+    <w:rsid w:val="00A96B41"/>
     <w:pPr>
       <w:keepNext/>
       <w:keepLines/>
@@ -679,7 +679,7 @@
     <w:semiHidden/>
     <w:unhideWhenUsed/>
     <w:qFormat/>
-    <w:rsid w:val="001A40AC"/>
+    <w:rsid w:val="00A96B41"/>
     <w:pPr>
       <w:keepNext/>
       <w:keepLines/>
@@ -701,7 +701,7 @@
     <w:semiHidden/>
     <w:unhideWhenUsed/>
     <w:qFormat/>
-    <w:rsid w:val="001A40AC"/>
+    <w:rsid w:val="00A96B41"/>
     <w:pPr>
       <w:keepNext/>
       <w:keepLines/>
@@ -744,10 +744,10 @@
     <w:basedOn w:val="DefaultParagraphFont"/>
     <w:link w:val="Heading1"/>
     <w:uiPriority w:val="9"/>
-    <w:rsid w:val="001A40AC"/>
+    <w:rsid w:val="00A96B41"/>
     <w:rPr>
       <w:rFonts w:asciiTheme="majorHAnsi" w:eastAsiaTheme="majorEastAsia" w:hAnsiTheme="majorHAnsi" w:cstheme="majorBidi"/>
-      <w:color w:val="0F4761" w:themeColor="accent1" w:themeShade="BF"/>
+      <w:color w:val="2F5496" w:themeColor="accent1" w:themeShade="BF"/>
       <w:sz w:val="40"/>
       <w:szCs w:val="40"/>
     </w:rPr>
@@ -758,10 +758,10 @@
     <w:link w:val="Heading2"/>
     <w:uiPriority w:val="9"/>
     <w:semiHidden/>
-    <w:rsid w:val="001A40AC"/>
+    <w:rsid w:val="00A96B41"/>
     <w:rPr>
       <w:rFonts w:asciiTheme="majorHAnsi" w:eastAsiaTheme="majorEastAsia" w:hAnsiTheme="majorHAnsi" w:cstheme="majorBidi"/>
-      <w:color w:val="0F4761" w:themeColor="accent1" w:themeShade="BF"/>
+      <w:color w:val="2F5496" w:themeColor="accent1" w:themeShade="BF"/>
       <w:sz w:val="32"/>
       <w:szCs w:val="32"/>
     </w:rPr>
@@ -772,10 +772,10 @@
     <w:link w:val="Heading3"/>
     <w:uiPriority w:val="9"/>
     <w:semiHidden/>
-    <w:rsid w:val="001A40AC"/>
-    <w:rPr>
-      <w:rFonts w:eastAsiaTheme="majorEastAsia" w:cstheme="majorBidi"/>
-      <w:color w:val="0F4761" w:themeColor="accent1" w:themeShade="BF"/>
+    <w:rsid w:val="00A96B41"/>
+    <w:rPr>
+      <w:rFonts w:eastAsiaTheme="majorEastAsia" w:cstheme="majorBidi"/>
+      <w:color w:val="2F5496" w:themeColor="accent1" w:themeShade="BF"/>
       <w:sz w:val="28"/>
       <w:szCs w:val="28"/>
     </w:rPr>
@@ -786,12 +786,12 @@
     <w:link w:val="Heading4"/>
     <w:uiPriority w:val="9"/>
     <w:semiHidden/>
-    <w:rsid w:val="001A40AC"/>
+    <w:rsid w:val="00A96B41"/>
     <w:rPr>
       <w:rFonts w:eastAsiaTheme="majorEastAsia" w:cstheme="majorBidi"/>
       <w:i/>
       <w:iCs/>
-      <w:color w:val="0F4761" w:themeColor="accent1" w:themeShade="BF"/>
+      <w:color w:val="2F5496" w:themeColor="accent1" w:themeShade="BF"/>
     </w:rPr>
   </w:style>
   <w:style w:type="character" w:customStyle="1" w:styleId="Heading5Char">
@@ -800,10 +800,10 @@
     <w:link w:val="Heading5"/>
     <w:uiPriority w:val="9"/>
     <w:semiHidden/>
-    <w:rsid w:val="001A40AC"/>
-    <w:rPr>
-      <w:rFonts w:eastAsiaTheme="majorEastAsia" w:cstheme="majorBidi"/>
-      <w:color w:val="0F4761" w:themeColor="accent1" w:themeShade="BF"/>
+    <w:rsid w:val="00A96B41"/>
+    <w:rPr>
+      <w:rFonts w:eastAsiaTheme="majorEastAsia" w:cstheme="majorBidi"/>
+      <w:color w:val="2F5496" w:themeColor="accent1" w:themeShade="BF"/>
     </w:rPr>
   </w:style>
   <w:style w:type="character" w:customStyle="1" w:styleId="Heading6Char">
@@ -812,7 +812,7 @@
     <w:link w:val="Heading6"/>
     <w:uiPriority w:val="9"/>
     <w:semiHidden/>
-    <w:rsid w:val="001A40AC"/>
+    <w:rsid w:val="00A96B41"/>
     <w:rPr>
       <w:rFonts w:eastAsiaTheme="majorEastAsia" w:cstheme="majorBidi"/>
       <w:i/>
@@ -826,7 +826,7 @@
     <w:link w:val="Heading7"/>
     <w:uiPriority w:val="9"/>
     <w:semiHidden/>
-    <w:rsid w:val="001A40AC"/>
+    <w:rsid w:val="00A96B41"/>
     <w:rPr>
       <w:rFonts w:eastAsiaTheme="majorEastAsia" w:cstheme="majorBidi"/>
       <w:color w:val="595959" w:themeColor="text1" w:themeTint="A6"/>
@@ -838,7 +838,7 @@
     <w:link w:val="Heading8"/>
     <w:uiPriority w:val="9"/>
     <w:semiHidden/>
-    <w:rsid w:val="001A40AC"/>
+    <w:rsid w:val="00A96B41"/>
     <w:rPr>
       <w:rFonts w:eastAsiaTheme="majorEastAsia" w:cstheme="majorBidi"/>
       <w:i/>
@@ -852,7 +852,7 @@
     <w:link w:val="Heading9"/>
     <w:uiPriority w:val="9"/>
     <w:semiHidden/>
-    <w:rsid w:val="001A40AC"/>
+    <w:rsid w:val="00A96B41"/>
     <w:rPr>
       <w:rFonts w:eastAsiaTheme="majorEastAsia" w:cstheme="majorBidi"/>
       <w:color w:val="272727" w:themeColor="text1" w:themeTint="D8"/>
@@ -865,7 +865,7 @@
     <w:link w:val="TitleChar"/>
     <w:uiPriority w:val="10"/>
     <w:qFormat/>
-    <w:rsid w:val="001A40AC"/>
+    <w:rsid w:val="00A96B41"/>
     <w:pPr>
       <w:spacing w:after="80" w:line="240" w:lineRule="auto"/>
       <w:contextualSpacing/>
@@ -883,7 +883,7 @@
     <w:basedOn w:val="DefaultParagraphFont"/>
     <w:link w:val="Title"/>
     <w:uiPriority w:val="10"/>
-    <w:rsid w:val="001A40AC"/>
+    <w:rsid w:val="00A96B41"/>
     <w:rPr>
       <w:rFonts w:asciiTheme="majorHAnsi" w:eastAsiaTheme="majorEastAsia" w:hAnsiTheme="majorHAnsi" w:cstheme="majorBidi"/>
       <w:spacing w:val="-10"/>
@@ -899,7 +899,7 @@
     <w:link w:val="SubtitleChar"/>
     <w:uiPriority w:val="11"/>
     <w:qFormat/>
-    <w:rsid w:val="001A40AC"/>
+    <w:rsid w:val="00A96B41"/>
     <w:pPr>
       <w:numPr>
         <w:ilvl w:val="1"/>
@@ -918,7 +918,7 @@
     <w:basedOn w:val="DefaultParagraphFont"/>
     <w:link w:val="Subtitle"/>
     <w:uiPriority w:val="11"/>
-    <w:rsid w:val="001A40AC"/>
+    <w:rsid w:val="00A96B41"/>
     <w:rPr>
       <w:rFonts w:eastAsiaTheme="majorEastAsia" w:cstheme="majorBidi"/>
       <w:color w:val="595959" w:themeColor="text1" w:themeTint="A6"/>
@@ -934,7 +934,7 @@
     <w:link w:val="QuoteChar"/>
     <w:uiPriority w:val="29"/>
     <w:qFormat/>
-    <w:rsid w:val="001A40AC"/>
+    <w:rsid w:val="00A96B41"/>
     <w:pPr>
       <w:spacing w:before="160"/>
       <w:jc w:val="center"/>
@@ -950,7 +950,7 @@
     <w:basedOn w:val="DefaultParagraphFont"/>
     <w:link w:val="Quote"/>
     <w:uiPriority w:val="29"/>
-    <w:rsid w:val="001A40AC"/>
+    <w:rsid w:val="00A96B41"/>
     <w:rPr>
       <w:i/>
       <w:iCs/>
@@ -962,7 +962,7 @@
     <w:basedOn w:val="Normal"/>
     <w:uiPriority w:val="34"/>
     <w:qFormat/>
-    <w:rsid w:val="001A40AC"/>
+    <w:rsid w:val="00A96B41"/>
     <w:pPr>
       <w:ind w:left="720"/>
       <w:contextualSpacing/>
@@ -973,11 +973,11 @@
     <w:basedOn w:val="DefaultParagraphFont"/>
     <w:uiPriority w:val="21"/>
     <w:qFormat/>
-    <w:rsid w:val="001A40AC"/>
+    <w:rsid w:val="00A96B41"/>
     <w:rPr>
       <w:i/>
       <w:iCs/>
-      <w:color w:val="0F4761" w:themeColor="accent1" w:themeShade="BF"/>
+      <w:color w:val="2F5496" w:themeColor="accent1" w:themeShade="BF"/>
     </w:rPr>
   </w:style>
   <w:style w:type="paragraph" w:styleId="IntenseQuote">
@@ -987,11 +987,11 @@
     <w:link w:val="IntenseQuoteChar"/>
     <w:uiPriority w:val="30"/>
     <w:qFormat/>
-    <w:rsid w:val="001A40AC"/>
+    <w:rsid w:val="00A96B41"/>
     <w:pPr>
       <w:pBdr>
-        <w:top w:val="single" w:sz="4" w:space="10" w:color="0F4761" w:themeColor="accent1" w:themeShade="BF"/>
-        <w:bottom w:val="single" w:sz="4" w:space="10" w:color="0F4761" w:themeColor="accent1" w:themeShade="BF"/>
+        <w:top w:val="single" w:sz="4" w:space="10" w:color="2F5496" w:themeColor="accent1" w:themeShade="BF"/>
+        <w:bottom w:val="single" w:sz="4" w:space="10" w:color="2F5496" w:themeColor="accent1" w:themeShade="BF"/>
       </w:pBdr>
       <w:spacing w:before="360" w:after="360"/>
       <w:ind w:left="864" w:right="864"/>
@@ -1000,7 +1000,7 @@
     <w:rPr>
       <w:i/>
       <w:iCs/>
-      <w:color w:val="0F4761" w:themeColor="accent1" w:themeShade="BF"/>
+      <w:color w:val="2F5496" w:themeColor="accent1" w:themeShade="BF"/>
     </w:rPr>
   </w:style>
   <w:style w:type="character" w:customStyle="1" w:styleId="IntenseQuoteChar">
@@ -1008,11 +1008,11 @@
     <w:basedOn w:val="DefaultParagraphFont"/>
     <w:link w:val="IntenseQuote"/>
     <w:uiPriority w:val="30"/>
-    <w:rsid w:val="001A40AC"/>
+    <w:rsid w:val="00A96B41"/>
     <w:rPr>
       <w:i/>
       <w:iCs/>
-      <w:color w:val="0F4761" w:themeColor="accent1" w:themeShade="BF"/>
+      <w:color w:val="2F5496" w:themeColor="accent1" w:themeShade="BF"/>
     </w:rPr>
   </w:style>
   <w:style w:type="character" w:styleId="IntenseReference">
@@ -1020,12 +1020,12 @@
     <w:basedOn w:val="DefaultParagraphFont"/>
     <w:uiPriority w:val="32"/>
     <w:qFormat/>
-    <w:rsid w:val="001A40AC"/>
+    <w:rsid w:val="00A96B41"/>
     <w:rPr>
       <w:b/>
       <w:bCs/>
       <w:smallCaps/>
-      <w:color w:val="0F4761" w:themeColor="accent1" w:themeShade="BF"/>
+      <w:color w:val="2F5496" w:themeColor="accent1" w:themeShade="BF"/>
       <w:spacing w:val="5"/>
     </w:rPr>
   </w:style>
@@ -1043,39 +1043,39 @@
         <a:sysClr val="window" lastClr="FFFFFF"/>
       </a:lt1>
       <a:dk2>
-        <a:srgbClr val="0E2841"/>
+        <a:srgbClr val="44546A"/>
       </a:dk2>
       <a:lt2>
-        <a:srgbClr val="E8E8E8"/>
+        <a:srgbClr val="E7E6E6"/>
       </a:lt2>
       <a:accent1>
-        <a:srgbClr val="156082"/>
+        <a:srgbClr val="4472C4"/>
       </a:accent1>
       <a:accent2>
-        <a:srgbClr val="E97132"/>
+        <a:srgbClr val="ED7D31"/>
       </a:accent2>
       <a:accent3>
-        <a:srgbClr val="196B24"/>
+        <a:srgbClr val="A5A5A5"/>
       </a:accent3>
       <a:accent4>
-        <a:srgbClr val="0F9ED5"/>
+        <a:srgbClr val="FFC000"/>
       </a:accent4>
       <a:accent5>
-        <a:srgbClr val="A02B93"/>
+        <a:srgbClr val="5B9BD5"/>
       </a:accent5>
       <a:accent6>
-        <a:srgbClr val="4EA72E"/>
+        <a:srgbClr val="70AD47"/>
       </a:accent6>
       <a:hlink>
-        <a:srgbClr val="467886"/>
+        <a:srgbClr val="0563C1"/>
       </a:hlink>
       <a:folHlink>
-        <a:srgbClr val="96607D"/>
+        <a:srgbClr val="954F72"/>
       </a:folHlink>
     </a:clrScheme>
     <a:fontScheme name="Office">
       <a:majorFont>
-        <a:latin typeface="Aptos Display" panose="02110004020202020204"/>
+        <a:latin typeface="Calibri Light" panose="020F0302020204030204"/>
         <a:ea typeface=""/>
         <a:cs typeface=""/>
         <a:font script="Jpan" typeface="游ゴシック Light"/>
@@ -1127,7 +1127,7 @@
         <a:font script="Tfng" typeface="Ebrima"/>
       </a:majorFont>
       <a:minorFont>
-        <a:latin typeface="Aptos" panose="02110004020202020204"/>
+        <a:latin typeface="Calibri" panose="020F0502020204030204"/>
         <a:ea typeface=""/>
         <a:cs typeface=""/>
         <a:font script="Jpan" typeface="游明朝"/>
@@ -1238,6 +1238,13 @@
         </a:gradFill>
       </a:fillStyleLst>
       <a:lnStyleLst>
+        <a:ln w="6350" cap="flat" cmpd="sng" algn="ctr">
+          <a:solidFill>
+            <a:schemeClr val="phClr"/>
+          </a:solidFill>
+          <a:prstDash val="solid"/>
+          <a:miter lim="800000"/>
+        </a:ln>
         <a:ln w="12700" cap="flat" cmpd="sng" algn="ctr">
           <a:solidFill>
             <a:schemeClr val="phClr"/>
@@ -1246,13 +1253,6 @@
           <a:miter lim="800000"/>
         </a:ln>
         <a:ln w="19050" cap="flat" cmpd="sng" algn="ctr">
-          <a:solidFill>
-            <a:schemeClr val="phClr"/>
-          </a:solidFill>
-          <a:prstDash val="solid"/>
-          <a:miter lim="800000"/>
-        </a:ln>
-        <a:ln w="25400" cap="flat" cmpd="sng" algn="ctr">
           <a:solidFill>
             <a:schemeClr val="phClr"/>
           </a:solidFill>
@@ -1317,31 +1317,11 @@
       </a:bgFillStyleLst>
     </a:fmtScheme>
   </a:themeElements>
-  <a:objectDefaults>
-    <a:lnDef>
-      <a:spPr/>
-      <a:bodyPr/>
-      <a:lstStyle/>
-      <a:style>
-        <a:lnRef idx="2">
-          <a:schemeClr val="accent1"/>
-        </a:lnRef>
-        <a:fillRef idx="0">
-          <a:schemeClr val="accent1"/>
-        </a:fillRef>
-        <a:effectRef idx="1">
-          <a:schemeClr val="accent1"/>
-        </a:effectRef>
-        <a:fontRef idx="minor">
-          <a:schemeClr val="tx1"/>
-        </a:fontRef>
-      </a:style>
-    </a:lnDef>
-  </a:objectDefaults>
+  <a:objectDefaults/>
   <a:extraClrSchemeLst/>
   <a:extLst>
     <a:ext uri="{05A4C25C-085E-4340-85A3-A5531E510DB2}">
-      <thm15:themeFamily xmlns:thm15="http://schemas.microsoft.com/office/thememl/2012/main" name="Office Theme" id="{2E142A2C-CD16-42D6-873A-C26D2A0506FA}" vid="{1BDDFF52-6CD6-40A5-AB3C-68EB2F1E4D0A}"/>
+      <thm15:themeFamily xmlns:thm15="http://schemas.microsoft.com/office/thememl/2012/main" name="Office Theme" id="{62F939B6-93AF-4DB8-9C6B-D6C7DFDC589F}" vid="{4A3C46E8-61CC-4603-A589-7422A47A8E4A}"/>
     </a:ext>
   </a:extLst>
 </a:theme>

</xml_diff>

<commit_message>
Prepare second revision submission package
</commit_message>
<xml_diff>
--- a/submission/AJPT_Cover_Letter.docx
+++ b/submission/AJPT_Cover_Letter.docx
@@ -29,7 +29,7 @@
     </w:p>
     <w:p>
       <w:r>
-        <w:t>We are pleased to submit our manuscript, "Retrieval as Research Design in LLM-Based Audit Research: Retrieval-Environment Validity and XBRL-Augmented Retrieval," for consideration under AJPT's Methodological Papers call.</w:t>
+        <w:t>We are pleased to submit our manuscript, "Retrieval as Research Design in LLM-Based Audit Research: Retrieval-Environment Validity and XBRL Relational Retrieval," for consideration under AJPT's Methodological Papers call.</w:t>
       </w:r>
     </w:p>
     <w:p>
@@ -39,7 +39,7 @@
     </w:p>
     <w:p>
       <w:r>
-        <w:t>The manuscript introduces retrieval-environment validity, defined as the extent to which the dynamically retrieved information environment supplied to an LLM aligns with the audit construct a researcher intends to study. We operationalize the framework through five validity dimensions: selection, representation, stability, traceability, and separability. The paper also provides a retrieval typology, construct-to-retrieval mapping, claim-level correctness protocol, failure-mode taxonomy, tiered reporting standard, and reproducibility guidance.</w:t>
+        <w:t>The manuscript introduces retrieval-environment validity, defined as the extent to which the dynamically retrieved information environment supplied to an LLM aligns with the audit construct a researcher intends to study. We operationalize the framework through five validity dimensions: selection, representation, stability, traceability, and separability. The paper also provides a retrieval typology, construct-to-retrieval mapping, claim-level correctness protocol, failure-mode taxonomy, tiered reporting guidance, and reproducibility standards.</w:t>
       </w:r>
     </w:p>
     <w:p>
@@ -64,7 +64,7 @@
     </w:p>
     <w:p>
       <w:r>
-        <w:t>The manuscript has not been published and is not under consideration elsewhere. [All authors have approved the submission.] [The authors have no conflicts of interest to disclose / Disclosures are provided on the title page.] [The manuscript includes supplemental materials intended for reviewer inspection and potential publication.] A generative AI and AI-assisted technology disclosure is included in the manuscript.</w:t>
+        <w:t>The manuscript has not been published and is not under consideration elsewhere. [Insert final author-approval statement.] [Insert final conflict-of-interest and disclosure statement.] [Confirm the final supplemental-materials statement.] A generative AI and AI-assisted technology disclosure is included in the manuscript.</w:t>
       </w:r>
     </w:p>
     <w:p>
@@ -522,7 +522,7 @@
     <w:link w:val="Heading1Char"/>
     <w:uiPriority w:val="9"/>
     <w:qFormat/>
-    <w:rsid w:val="00A96B41"/>
+    <w:rsid w:val="00C62827"/>
     <w:pPr>
       <w:keepNext/>
       <w:keepLines/>
@@ -545,7 +545,7 @@
     <w:semiHidden/>
     <w:unhideWhenUsed/>
     <w:qFormat/>
-    <w:rsid w:val="00A96B41"/>
+    <w:rsid w:val="00C62827"/>
     <w:pPr>
       <w:keepNext/>
       <w:keepLines/>
@@ -568,7 +568,7 @@
     <w:semiHidden/>
     <w:unhideWhenUsed/>
     <w:qFormat/>
-    <w:rsid w:val="00A96B41"/>
+    <w:rsid w:val="00C62827"/>
     <w:pPr>
       <w:keepNext/>
       <w:keepLines/>
@@ -591,7 +591,7 @@
     <w:semiHidden/>
     <w:unhideWhenUsed/>
     <w:qFormat/>
-    <w:rsid w:val="00A96B41"/>
+    <w:rsid w:val="00C62827"/>
     <w:pPr>
       <w:keepNext/>
       <w:keepLines/>
@@ -614,7 +614,7 @@
     <w:semiHidden/>
     <w:unhideWhenUsed/>
     <w:qFormat/>
-    <w:rsid w:val="00A96B41"/>
+    <w:rsid w:val="00C62827"/>
     <w:pPr>
       <w:keepNext/>
       <w:keepLines/>
@@ -635,7 +635,7 @@
     <w:semiHidden/>
     <w:unhideWhenUsed/>
     <w:qFormat/>
-    <w:rsid w:val="00A96B41"/>
+    <w:rsid w:val="00C62827"/>
     <w:pPr>
       <w:keepNext/>
       <w:keepLines/>
@@ -658,7 +658,7 @@
     <w:semiHidden/>
     <w:unhideWhenUsed/>
     <w:qFormat/>
-    <w:rsid w:val="00A96B41"/>
+    <w:rsid w:val="00C62827"/>
     <w:pPr>
       <w:keepNext/>
       <w:keepLines/>
@@ -679,7 +679,7 @@
     <w:semiHidden/>
     <w:unhideWhenUsed/>
     <w:qFormat/>
-    <w:rsid w:val="00A96B41"/>
+    <w:rsid w:val="00C62827"/>
     <w:pPr>
       <w:keepNext/>
       <w:keepLines/>
@@ -701,7 +701,7 @@
     <w:semiHidden/>
     <w:unhideWhenUsed/>
     <w:qFormat/>
-    <w:rsid w:val="00A96B41"/>
+    <w:rsid w:val="00C62827"/>
     <w:pPr>
       <w:keepNext/>
       <w:keepLines/>
@@ -744,7 +744,7 @@
     <w:basedOn w:val="DefaultParagraphFont"/>
     <w:link w:val="Heading1"/>
     <w:uiPriority w:val="9"/>
-    <w:rsid w:val="00A96B41"/>
+    <w:rsid w:val="00C62827"/>
     <w:rPr>
       <w:rFonts w:asciiTheme="majorHAnsi" w:eastAsiaTheme="majorEastAsia" w:hAnsiTheme="majorHAnsi" w:cstheme="majorBidi"/>
       <w:color w:val="2F5496" w:themeColor="accent1" w:themeShade="BF"/>
@@ -758,7 +758,7 @@
     <w:link w:val="Heading2"/>
     <w:uiPriority w:val="9"/>
     <w:semiHidden/>
-    <w:rsid w:val="00A96B41"/>
+    <w:rsid w:val="00C62827"/>
     <w:rPr>
       <w:rFonts w:asciiTheme="majorHAnsi" w:eastAsiaTheme="majorEastAsia" w:hAnsiTheme="majorHAnsi" w:cstheme="majorBidi"/>
       <w:color w:val="2F5496" w:themeColor="accent1" w:themeShade="BF"/>
@@ -772,7 +772,7 @@
     <w:link w:val="Heading3"/>
     <w:uiPriority w:val="9"/>
     <w:semiHidden/>
-    <w:rsid w:val="00A96B41"/>
+    <w:rsid w:val="00C62827"/>
     <w:rPr>
       <w:rFonts w:eastAsiaTheme="majorEastAsia" w:cstheme="majorBidi"/>
       <w:color w:val="2F5496" w:themeColor="accent1" w:themeShade="BF"/>
@@ -786,7 +786,7 @@
     <w:link w:val="Heading4"/>
     <w:uiPriority w:val="9"/>
     <w:semiHidden/>
-    <w:rsid w:val="00A96B41"/>
+    <w:rsid w:val="00C62827"/>
     <w:rPr>
       <w:rFonts w:eastAsiaTheme="majorEastAsia" w:cstheme="majorBidi"/>
       <w:i/>
@@ -800,7 +800,7 @@
     <w:link w:val="Heading5"/>
     <w:uiPriority w:val="9"/>
     <w:semiHidden/>
-    <w:rsid w:val="00A96B41"/>
+    <w:rsid w:val="00C62827"/>
     <w:rPr>
       <w:rFonts w:eastAsiaTheme="majorEastAsia" w:cstheme="majorBidi"/>
       <w:color w:val="2F5496" w:themeColor="accent1" w:themeShade="BF"/>
@@ -812,7 +812,7 @@
     <w:link w:val="Heading6"/>
     <w:uiPriority w:val="9"/>
     <w:semiHidden/>
-    <w:rsid w:val="00A96B41"/>
+    <w:rsid w:val="00C62827"/>
     <w:rPr>
       <w:rFonts w:eastAsiaTheme="majorEastAsia" w:cstheme="majorBidi"/>
       <w:i/>
@@ -826,7 +826,7 @@
     <w:link w:val="Heading7"/>
     <w:uiPriority w:val="9"/>
     <w:semiHidden/>
-    <w:rsid w:val="00A96B41"/>
+    <w:rsid w:val="00C62827"/>
     <w:rPr>
       <w:rFonts w:eastAsiaTheme="majorEastAsia" w:cstheme="majorBidi"/>
       <w:color w:val="595959" w:themeColor="text1" w:themeTint="A6"/>
@@ -838,7 +838,7 @@
     <w:link w:val="Heading8"/>
     <w:uiPriority w:val="9"/>
     <w:semiHidden/>
-    <w:rsid w:val="00A96B41"/>
+    <w:rsid w:val="00C62827"/>
     <w:rPr>
       <w:rFonts w:eastAsiaTheme="majorEastAsia" w:cstheme="majorBidi"/>
       <w:i/>
@@ -852,7 +852,7 @@
     <w:link w:val="Heading9"/>
     <w:uiPriority w:val="9"/>
     <w:semiHidden/>
-    <w:rsid w:val="00A96B41"/>
+    <w:rsid w:val="00C62827"/>
     <w:rPr>
       <w:rFonts w:eastAsiaTheme="majorEastAsia" w:cstheme="majorBidi"/>
       <w:color w:val="272727" w:themeColor="text1" w:themeTint="D8"/>
@@ -865,7 +865,7 @@
     <w:link w:val="TitleChar"/>
     <w:uiPriority w:val="10"/>
     <w:qFormat/>
-    <w:rsid w:val="00A96B41"/>
+    <w:rsid w:val="00C62827"/>
     <w:pPr>
       <w:spacing w:after="80" w:line="240" w:lineRule="auto"/>
       <w:contextualSpacing/>
@@ -883,7 +883,7 @@
     <w:basedOn w:val="DefaultParagraphFont"/>
     <w:link w:val="Title"/>
     <w:uiPriority w:val="10"/>
-    <w:rsid w:val="00A96B41"/>
+    <w:rsid w:val="00C62827"/>
     <w:rPr>
       <w:rFonts w:asciiTheme="majorHAnsi" w:eastAsiaTheme="majorEastAsia" w:hAnsiTheme="majorHAnsi" w:cstheme="majorBidi"/>
       <w:spacing w:val="-10"/>
@@ -899,7 +899,7 @@
     <w:link w:val="SubtitleChar"/>
     <w:uiPriority w:val="11"/>
     <w:qFormat/>
-    <w:rsid w:val="00A96B41"/>
+    <w:rsid w:val="00C62827"/>
     <w:pPr>
       <w:numPr>
         <w:ilvl w:val="1"/>
@@ -918,7 +918,7 @@
     <w:basedOn w:val="DefaultParagraphFont"/>
     <w:link w:val="Subtitle"/>
     <w:uiPriority w:val="11"/>
-    <w:rsid w:val="00A96B41"/>
+    <w:rsid w:val="00C62827"/>
     <w:rPr>
       <w:rFonts w:eastAsiaTheme="majorEastAsia" w:cstheme="majorBidi"/>
       <w:color w:val="595959" w:themeColor="text1" w:themeTint="A6"/>
@@ -934,7 +934,7 @@
     <w:link w:val="QuoteChar"/>
     <w:uiPriority w:val="29"/>
     <w:qFormat/>
-    <w:rsid w:val="00A96B41"/>
+    <w:rsid w:val="00C62827"/>
     <w:pPr>
       <w:spacing w:before="160"/>
       <w:jc w:val="center"/>
@@ -950,7 +950,7 @@
     <w:basedOn w:val="DefaultParagraphFont"/>
     <w:link w:val="Quote"/>
     <w:uiPriority w:val="29"/>
-    <w:rsid w:val="00A96B41"/>
+    <w:rsid w:val="00C62827"/>
     <w:rPr>
       <w:i/>
       <w:iCs/>
@@ -962,7 +962,7 @@
     <w:basedOn w:val="Normal"/>
     <w:uiPriority w:val="34"/>
     <w:qFormat/>
-    <w:rsid w:val="00A96B41"/>
+    <w:rsid w:val="00C62827"/>
     <w:pPr>
       <w:ind w:left="720"/>
       <w:contextualSpacing/>
@@ -973,7 +973,7 @@
     <w:basedOn w:val="DefaultParagraphFont"/>
     <w:uiPriority w:val="21"/>
     <w:qFormat/>
-    <w:rsid w:val="00A96B41"/>
+    <w:rsid w:val="00C62827"/>
     <w:rPr>
       <w:i/>
       <w:iCs/>
@@ -987,7 +987,7 @@
     <w:link w:val="IntenseQuoteChar"/>
     <w:uiPriority w:val="30"/>
     <w:qFormat/>
-    <w:rsid w:val="00A96B41"/>
+    <w:rsid w:val="00C62827"/>
     <w:pPr>
       <w:pBdr>
         <w:top w:val="single" w:sz="4" w:space="10" w:color="2F5496" w:themeColor="accent1" w:themeShade="BF"/>
@@ -1008,7 +1008,7 @@
     <w:basedOn w:val="DefaultParagraphFont"/>
     <w:link w:val="IntenseQuote"/>
     <w:uiPriority w:val="30"/>
-    <w:rsid w:val="00A96B41"/>
+    <w:rsid w:val="00C62827"/>
     <w:rPr>
       <w:i/>
       <w:iCs/>
@@ -1020,7 +1020,7 @@
     <w:basedOn w:val="DefaultParagraphFont"/>
     <w:uiPriority w:val="32"/>
     <w:qFormat/>
-    <w:rsid w:val="00A96B41"/>
+    <w:rsid w:val="00C62827"/>
     <w:rPr>
       <w:b/>
       <w:bCs/>

</xml_diff>